<commit_message>
Update CV with OpenAI Build Week Manila
</commit_message>
<xml_diff>
--- a/public/cv/CV_Charles_Joshua_Uy.docx
+++ b/public/cv/CV_Charles_Joshua_Uy.docx
@@ -9942,6 +9942,125 @@
           <w:szCs w:val="20"/>
         </w:rPr>
         <w:t xml:space="preserve">Participant. International summit for cultural exchange.</w:t>
+      </w:r>
+    </w:p>
+    <w:p>
+      <w:pPr>
+        <w:keepNext/>
+        <w:pBdr>
+          <w:bottom w:val="single" w:color="999999" w:sz="4" w:space="3"/>
+        </w:pBdr>
+        <w:spacing w:after="100" w:before="300"/>
+      </w:pPr>
+      <w:r>
+        <w:rPr>
+          <w:rFonts w:ascii="Times New Roman" w:cs="Times New Roman" w:eastAsia="Times New Roman" w:hAnsi="Times New Roman"/>
+          <w:b/>
+          <w:bCs/>
+          <w:smallCaps/>
+          <w:sz w:val="23"/>
+          <w:szCs w:val="23"/>
+        </w:rPr>
+        <w:t xml:space="preserve">Selected Events &amp; Recognition</w:t>
+      </w:r>
+    </w:p>
+    <w:tbl>
+      <w:tblPr>
+        <w:tblW w:type="dxa" w:w="9360"/>
+        <w:tblBorders>
+          <w:top w:val="single" w:color="auto" w:sz="4"/>
+          <w:left w:val="single" w:color="auto" w:sz="4"/>
+          <w:bottom w:val="single" w:color="auto" w:sz="4"/>
+          <w:right w:val="single" w:color="auto" w:sz="4"/>
+          <w:insideH w:val="single" w:color="auto" w:sz="4"/>
+          <w:insideV w:val="single" w:color="auto" w:sz="4"/>
+        </w:tblBorders>
+      </w:tblPr>
+      <w:tblGrid>
+        <w:gridCol w:w="6560"/>
+        <w:gridCol w:w="2800"/>
+      </w:tblGrid>
+      <w:tr>
+        <w:tc>
+          <w:tcPr>
+            <w:tcW w:type="dxa" w:w="6560"/>
+            <w:tcBorders>
+              <w:top w:val="none" w:color="FFFFFF" w:sz="0"/>
+              <w:left w:val="none" w:color="FFFFFF" w:sz="0"/>
+              <w:bottom w:val="none" w:color="FFFFFF" w:sz="0"/>
+              <w:right w:val="none" w:color="FFFFFF" w:sz="0"/>
+            </w:tcBorders>
+            <w:tcMar>
+              <w:top w:type="dxa" w:w="0"/>
+              <w:left w:type="dxa" w:w="0"/>
+              <w:bottom w:type="dxa" w:w="0"/>
+              <w:right w:type="dxa" w:w="0"/>
+            </w:tcMar>
+            <w:vAlign w:val="top"/>
+          </w:tcPr>
+          <w:p>
+            <w:pPr>
+              <w:keepNext/>
+              <w:spacing w:after="0" w:before="160"/>
+            </w:pPr>
+            <w:r>
+              <w:rPr>
+                <w:rFonts w:ascii="Times New Roman" w:cs="Times New Roman" w:eastAsia="Times New Roman" w:hAnsi="Times New Roman"/>
+                <w:b/>
+                <w:bCs/>
+                <w:sz w:val="20"/>
+                <w:szCs w:val="20"/>
+              </w:rPr>
+              <w:t xml:space="preserve">OpenAI Build Week Manila</w:t>
+            </w:r>
+          </w:p>
+        </w:tc>
+        <w:tc>
+          <w:tcPr>
+            <w:tcW w:type="dxa" w:w="2800"/>
+            <w:tcBorders>
+              <w:top w:val="none" w:color="FFFFFF" w:sz="0"/>
+              <w:left w:val="none" w:color="FFFFFF" w:sz="0"/>
+              <w:bottom w:val="none" w:color="FFFFFF" w:sz="0"/>
+              <w:right w:val="none" w:color="FFFFFF" w:sz="0"/>
+            </w:tcBorders>
+            <w:tcMar>
+              <w:top w:type="dxa" w:w="0"/>
+              <w:left w:type="dxa" w:w="0"/>
+              <w:bottom w:type="dxa" w:w="0"/>
+              <w:right w:type="dxa" w:w="0"/>
+            </w:tcMar>
+            <w:vAlign w:val="top"/>
+          </w:tcPr>
+          <w:p>
+            <w:pPr>
+              <w:keepNext/>
+              <w:spacing w:after="0" w:before="160"/>
+              <w:jc w:val="right"/>
+            </w:pPr>
+            <w:r>
+              <w:rPr>
+                <w:rFonts w:ascii="Times New Roman" w:cs="Times New Roman" w:eastAsia="Times New Roman" w:hAnsi="Times New Roman"/>
+                <w:sz w:val="20"/>
+                <w:szCs w:val="20"/>
+              </w:rPr>
+              <w:t xml:space="preserve">2026</w:t>
+            </w:r>
+          </w:p>
+        </w:tc>
+      </w:tr>
+    </w:tbl>
+    <w:p>
+      <w:pPr>
+        <w:spacing w:after="140"/>
+      </w:pPr>
+      <w:r>
+        <w:rPr>
+          <w:rFonts w:ascii="Times New Roman" w:cs="Times New Roman" w:eastAsia="Times New Roman" w:hAnsi="Times New Roman"/>
+          <w:sz w:val="20"/>
+          <w:szCs w:val="20"/>
+        </w:rPr>
+        <w:t xml:space="preserve">Participant. Received US$150 in Codex and OpenAI API credits.</w:t>
       </w:r>
     </w:p>
     <w:p>

</xml_diff>

<commit_message>
Place OpenAI Build Week under Activities
</commit_message>
<xml_diff>
--- a/public/cv/CV_Charles_Joshua_Uy.docx
+++ b/public/cv/CV_Charles_Joshua_Uy.docx
@@ -9100,6 +9100,105 @@
                 <w:sz w:val="20"/>
                 <w:szCs w:val="20"/>
               </w:rPr>
+              <w:t xml:space="preserve">OpenAI Build Week Manila</w:t>
+            </w:r>
+          </w:p>
+        </w:tc>
+        <w:tc>
+          <w:tcPr>
+            <w:tcW w:type="dxa" w:w="2800"/>
+            <w:tcBorders>
+              <w:top w:val="none" w:color="FFFFFF" w:sz="0"/>
+              <w:left w:val="none" w:color="FFFFFF" w:sz="0"/>
+              <w:bottom w:val="none" w:color="FFFFFF" w:sz="0"/>
+              <w:right w:val="none" w:color="FFFFFF" w:sz="0"/>
+            </w:tcBorders>
+            <w:tcMar>
+              <w:top w:type="dxa" w:w="0"/>
+              <w:left w:type="dxa" w:w="0"/>
+              <w:bottom w:type="dxa" w:w="0"/>
+              <w:right w:type="dxa" w:w="0"/>
+            </w:tcMar>
+            <w:vAlign w:val="top"/>
+          </w:tcPr>
+          <w:p>
+            <w:pPr>
+              <w:keepNext/>
+              <w:spacing w:after="0" w:before="160"/>
+              <w:jc w:val="right"/>
+            </w:pPr>
+            <w:r>
+              <w:rPr>
+                <w:rFonts w:ascii="Times New Roman" w:cs="Times New Roman" w:eastAsia="Times New Roman" w:hAnsi="Times New Roman"/>
+                <w:sz w:val="20"/>
+                <w:szCs w:val="20"/>
+              </w:rPr>
+              <w:t xml:space="preserve">2026</w:t>
+            </w:r>
+          </w:p>
+        </w:tc>
+      </w:tr>
+    </w:tbl>
+    <w:p>
+      <w:pPr>
+        <w:spacing w:after="140"/>
+      </w:pPr>
+      <w:r>
+        <w:rPr>
+          <w:rFonts w:ascii="Times New Roman" w:cs="Times New Roman" w:eastAsia="Times New Roman" w:hAnsi="Times New Roman"/>
+          <w:sz w:val="20"/>
+          <w:szCs w:val="20"/>
+        </w:rPr>
+        <w:t xml:space="preserve">Participant. Received US$150 in Codex and OpenAI API credits.</w:t>
+      </w:r>
+    </w:p>
+    <w:tbl>
+      <w:tblPr>
+        <w:tblW w:type="dxa" w:w="9360"/>
+        <w:tblBorders>
+          <w:top w:val="single" w:color="auto" w:sz="4"/>
+          <w:left w:val="single" w:color="auto" w:sz="4"/>
+          <w:bottom w:val="single" w:color="auto" w:sz="4"/>
+          <w:right w:val="single" w:color="auto" w:sz="4"/>
+          <w:insideH w:val="single" w:color="auto" w:sz="4"/>
+          <w:insideV w:val="single" w:color="auto" w:sz="4"/>
+        </w:tblBorders>
+      </w:tblPr>
+      <w:tblGrid>
+        <w:gridCol w:w="6560"/>
+        <w:gridCol w:w="2800"/>
+      </w:tblGrid>
+      <w:tr>
+        <w:tc>
+          <w:tcPr>
+            <w:tcW w:type="dxa" w:w="6560"/>
+            <w:tcBorders>
+              <w:top w:val="none" w:color="FFFFFF" w:sz="0"/>
+              <w:left w:val="none" w:color="FFFFFF" w:sz="0"/>
+              <w:bottom w:val="none" w:color="FFFFFF" w:sz="0"/>
+              <w:right w:val="none" w:color="FFFFFF" w:sz="0"/>
+            </w:tcBorders>
+            <w:tcMar>
+              <w:top w:type="dxa" w:w="0"/>
+              <w:left w:type="dxa" w:w="0"/>
+              <w:bottom w:type="dxa" w:w="0"/>
+              <w:right w:type="dxa" w:w="0"/>
+            </w:tcMar>
+            <w:vAlign w:val="top"/>
+          </w:tcPr>
+          <w:p>
+            <w:pPr>
+              <w:keepNext/>
+              <w:spacing w:after="0" w:before="160"/>
+            </w:pPr>
+            <w:r>
+              <w:rPr>
+                <w:rFonts w:ascii="Times New Roman" w:cs="Times New Roman" w:eastAsia="Times New Roman" w:hAnsi="Times New Roman"/>
+                <w:b/>
+                <w:bCs/>
+                <w:sz w:val="20"/>
+                <w:szCs w:val="20"/>
+              </w:rPr>
               <w:t xml:space="preserve">ARSAound</w:t>
             </w:r>
           </w:p>
@@ -9942,125 +10041,6 @@
           <w:szCs w:val="20"/>
         </w:rPr>
         <w:t xml:space="preserve">Participant. International summit for cultural exchange.</w:t>
-      </w:r>
-    </w:p>
-    <w:p>
-      <w:pPr>
-        <w:keepNext/>
-        <w:pBdr>
-          <w:bottom w:val="single" w:color="999999" w:sz="4" w:space="3"/>
-        </w:pBdr>
-        <w:spacing w:after="100" w:before="300"/>
-      </w:pPr>
-      <w:r>
-        <w:rPr>
-          <w:rFonts w:ascii="Times New Roman" w:cs="Times New Roman" w:eastAsia="Times New Roman" w:hAnsi="Times New Roman"/>
-          <w:b/>
-          <w:bCs/>
-          <w:smallCaps/>
-          <w:sz w:val="23"/>
-          <w:szCs w:val="23"/>
-        </w:rPr>
-        <w:t xml:space="preserve">Selected Events &amp; Recognition</w:t>
-      </w:r>
-    </w:p>
-    <w:tbl>
-      <w:tblPr>
-        <w:tblW w:type="dxa" w:w="9360"/>
-        <w:tblBorders>
-          <w:top w:val="single" w:color="auto" w:sz="4"/>
-          <w:left w:val="single" w:color="auto" w:sz="4"/>
-          <w:bottom w:val="single" w:color="auto" w:sz="4"/>
-          <w:right w:val="single" w:color="auto" w:sz="4"/>
-          <w:insideH w:val="single" w:color="auto" w:sz="4"/>
-          <w:insideV w:val="single" w:color="auto" w:sz="4"/>
-        </w:tblBorders>
-      </w:tblPr>
-      <w:tblGrid>
-        <w:gridCol w:w="6560"/>
-        <w:gridCol w:w="2800"/>
-      </w:tblGrid>
-      <w:tr>
-        <w:tc>
-          <w:tcPr>
-            <w:tcW w:type="dxa" w:w="6560"/>
-            <w:tcBorders>
-              <w:top w:val="none" w:color="FFFFFF" w:sz="0"/>
-              <w:left w:val="none" w:color="FFFFFF" w:sz="0"/>
-              <w:bottom w:val="none" w:color="FFFFFF" w:sz="0"/>
-              <w:right w:val="none" w:color="FFFFFF" w:sz="0"/>
-            </w:tcBorders>
-            <w:tcMar>
-              <w:top w:type="dxa" w:w="0"/>
-              <w:left w:type="dxa" w:w="0"/>
-              <w:bottom w:type="dxa" w:w="0"/>
-              <w:right w:type="dxa" w:w="0"/>
-            </w:tcMar>
-            <w:vAlign w:val="top"/>
-          </w:tcPr>
-          <w:p>
-            <w:pPr>
-              <w:keepNext/>
-              <w:spacing w:after="0" w:before="160"/>
-            </w:pPr>
-            <w:r>
-              <w:rPr>
-                <w:rFonts w:ascii="Times New Roman" w:cs="Times New Roman" w:eastAsia="Times New Roman" w:hAnsi="Times New Roman"/>
-                <w:b/>
-                <w:bCs/>
-                <w:sz w:val="20"/>
-                <w:szCs w:val="20"/>
-              </w:rPr>
-              <w:t xml:space="preserve">OpenAI Build Week Manila</w:t>
-            </w:r>
-          </w:p>
-        </w:tc>
-        <w:tc>
-          <w:tcPr>
-            <w:tcW w:type="dxa" w:w="2800"/>
-            <w:tcBorders>
-              <w:top w:val="none" w:color="FFFFFF" w:sz="0"/>
-              <w:left w:val="none" w:color="FFFFFF" w:sz="0"/>
-              <w:bottom w:val="none" w:color="FFFFFF" w:sz="0"/>
-              <w:right w:val="none" w:color="FFFFFF" w:sz="0"/>
-            </w:tcBorders>
-            <w:tcMar>
-              <w:top w:type="dxa" w:w="0"/>
-              <w:left w:type="dxa" w:w="0"/>
-              <w:bottom w:type="dxa" w:w="0"/>
-              <w:right w:type="dxa" w:w="0"/>
-            </w:tcMar>
-            <w:vAlign w:val="top"/>
-          </w:tcPr>
-          <w:p>
-            <w:pPr>
-              <w:keepNext/>
-              <w:spacing w:after="0" w:before="160"/>
-              <w:jc w:val="right"/>
-            </w:pPr>
-            <w:r>
-              <w:rPr>
-                <w:rFonts w:ascii="Times New Roman" w:cs="Times New Roman" w:eastAsia="Times New Roman" w:hAnsi="Times New Roman"/>
-                <w:sz w:val="20"/>
-                <w:szCs w:val="20"/>
-              </w:rPr>
-              <w:t xml:space="preserve">2026</w:t>
-            </w:r>
-          </w:p>
-        </w:tc>
-      </w:tr>
-    </w:tbl>
-    <w:p>
-      <w:pPr>
-        <w:spacing w:after="140"/>
-      </w:pPr>
-      <w:r>
-        <w:rPr>
-          <w:rFonts w:ascii="Times New Roman" w:cs="Times New Roman" w:eastAsia="Times New Roman" w:hAnsi="Times New Roman"/>
-          <w:sz w:val="20"/>
-          <w:szCs w:val="20"/>
-        </w:rPr>
-        <w:t xml:space="preserve">Participant. Received US$150 in Codex and OpenAI API credits.</w:t>
       </w:r>
     </w:p>
     <w:p>

</xml_diff>